<commit_message>
jai oublier declaration de ia
</commit_message>
<xml_diff>
--- a/docs/declaration de ia.docx
+++ b/docs/declaration de ia.docx
@@ -33,8 +33,18 @@
           <w:iCs/>
           <w:lang w:val="fr-FR"/>
         </w:rPr>
-        <w:t>Cégep Marie-Victorin</w:t>
-      </w:r>
+        <w:t xml:space="preserve">Cégep </w:t>
+      </w:r>
+      <w:proofErr w:type="spellStart"/>
+      <w:r>
+        <w:rPr>
+          <w:i/>
+          <w:iCs/>
+          <w:lang w:val="fr-FR"/>
+        </w:rPr>
+        <w:t>Marie-Victorin</w:t>
+      </w:r>
+      <w:proofErr w:type="spellEnd"/>
     </w:p>
     <w:p>
       <w:pPr>
@@ -67,13 +77,29 @@
           <w:bCs/>
           <w:lang w:val="fr-FR"/>
         </w:rPr>
-        <w:t>Nguyen Ta Anh Quoc</w:t>
-      </w:r>
-      <w:r>
-        <w:rPr>
-          <w:lang w:val="fr-FR"/>
-        </w:rPr>
-        <w:t xml:space="preserve">, atteste que le travail remis dans le cadre du cours </w:t>
+        <w:t xml:space="preserve">Nguyen Ta Anh </w:t>
+      </w:r>
+      <w:proofErr w:type="gramStart"/>
+      <w:r>
+        <w:rPr>
+          <w:b/>
+          <w:bCs/>
+          <w:lang w:val="fr-FR"/>
+        </w:rPr>
+        <w:t xml:space="preserve">Quoc </w:t>
+      </w:r>
+      <w:r>
+        <w:rPr>
+          <w:lang w:val="fr-FR"/>
+        </w:rPr>
+        <w:t>,</w:t>
+      </w:r>
+      <w:proofErr w:type="gramEnd"/>
+      <w:r>
+        <w:rPr>
+          <w:lang w:val="fr-FR"/>
+        </w:rPr>
+        <w:t xml:space="preserve"> atteste que le travail remis dans le cadre du cours </w:t>
       </w:r>
       <w:r>
         <w:rPr>
@@ -135,7 +161,21 @@
         <w:rPr>
           <w:lang w:val="fr-FR"/>
         </w:rPr>
-        <w:t>J'ai fait preuve de transparence quant à l'usage d'outils numériques (voir section IAgraphie ci-dessous).</w:t>
+        <w:t xml:space="preserve">J'ai fait preuve de transparence quant à l'usage d'outils numériques (voir section </w:t>
+      </w:r>
+      <w:proofErr w:type="spellStart"/>
+      <w:r>
+        <w:rPr>
+          <w:lang w:val="fr-FR"/>
+        </w:rPr>
+        <w:t>IAgraphie</w:t>
+      </w:r>
+      <w:proofErr w:type="spellEnd"/>
+      <w:r>
+        <w:rPr>
+          <w:lang w:val="fr-FR"/>
+        </w:rPr>
+        <w:t xml:space="preserve"> ci-dessous).</w:t>
       </w:r>
     </w:p>
     <w:p>
@@ -324,7 +364,25 @@
                 <w:bCs/>
                 <w:lang w:val="fr-FR"/>
               </w:rPr>
-              <w:t>Usage déclaré (IAgraphie)</w:t>
+              <w:t>Usage déclaré (</w:t>
+            </w:r>
+            <w:proofErr w:type="spellStart"/>
+            <w:r>
+              <w:rPr>
+                <w:b/>
+                <w:bCs/>
+                <w:lang w:val="fr-FR"/>
+              </w:rPr>
+              <w:t>IAgraphie</w:t>
+            </w:r>
+            <w:proofErr w:type="spellEnd"/>
+            <w:r>
+              <w:rPr>
+                <w:b/>
+                <w:bCs/>
+                <w:lang w:val="fr-FR"/>
+              </w:rPr>
+              <w:t>)</w:t>
             </w:r>
             <w:r>
               <w:rPr>
@@ -459,7 +517,7 @@
                 <w:b/>
                 <w:bCs/>
               </w:rPr>
-              <w:t>2026-09-24</w:t>
+              <w:t>2026-10-14</w:t>
             </w:r>
           </w:p>
           <w:p>
@@ -470,6 +528,30 @@
         </w:tc>
       </w:tr>
     </w:tbl>
+    <w:p/>
+    <w:p>
+      <w:proofErr w:type="spellStart"/>
+      <w:proofErr w:type="gramStart"/>
+      <w:r>
+        <w:t>Github</w:t>
+      </w:r>
+      <w:proofErr w:type="spellEnd"/>
+      <w:r>
+        <w:t xml:space="preserve"> :</w:t>
+      </w:r>
+      <w:proofErr w:type="gramEnd"/>
+      <w:r>
+        <w:t xml:space="preserve"> </w:t>
+      </w:r>
+      <w:hyperlink r:id="rId5" w:history="1">
+        <w:r>
+          <w:rPr>
+            <w:rStyle w:val="Hyperlink"/>
+          </w:rPr>
+          <w:t>https://github.com/taAnhQuoc/CampusRate</w:t>
+        </w:r>
+      </w:hyperlink>
+    </w:p>
     <w:p/>
     <w:sectPr>
       <w:pgSz w:w="12240" w:h="15840"/>
@@ -484,9 +566,9 @@
 <file path=word/numbering.xml><?xml version="1.0" encoding="utf-8"?>
 <w:numbering xmlns:wpc="http://schemas.microsoft.com/office/word/2010/wordprocessingCanvas" xmlns:cx="http://schemas.microsoft.com/office/drawing/2014/chartex" xmlns:cx1="http://schemas.microsoft.com/office/drawing/2015/9/8/chartex" xmlns:cx2="http://schemas.microsoft.com/office/drawing/2015/10/21/chartex" xmlns:cx3="http://schemas.microsoft.com/office/drawing/2016/5/9/chartex" xmlns:cx4="http://schemas.microsoft.com/office/drawing/2016/5/10/chartex" xmlns:cx5="http://schemas.microsoft.com/office/drawing/2016/5/11/chartex" xmlns:cx6="http://schemas.microsoft.com/office/drawing/2016/5/12/chartex" xmlns:cx7="http://schemas.microsoft.com/office/drawing/2016/5/13/chartex" xmlns:cx8="http://schemas.microsoft.com/office/drawing/2016/5/14/chartex" xmlns:mc="http://schemas.openxmlformats.org/markup-compatibility/2006" xmlns:aink="http://schemas.microsoft.com/office/drawing/2016/ink" xmlns:am3d="http://schemas.microsoft.com/office/drawing/2017/model3d" xmlns:o="urn:schemas-microsoft-com:office:office" xmlns:oel="http://schemas.microsoft.com/office/2019/extlst" xmlns:r="http://schemas.openxmlformats.org/officeDocument/2006/relationships" xmlns:m="http://schemas.openxmlformats.org/officeDocument/2006/math" xmlns:v="urn:schemas-microsoft-com:vml" xmlns:wp14="http://schemas.microsoft.com/office/word/2010/wordprocessingDrawing" xmlns:wp="http://schemas.openxmlformats.org/drawingml/2006/wordprocessingDrawing" xmlns:w10="urn:schemas-microsoft-com:office:word" xmlns:w="http://schemas.openxmlformats.org/wordprocessingml/2006/main" xmlns:w14="http://schemas.microsoft.com/office/word/2010/wordml" xmlns:w15="http://schemas.microsoft.com/office/word/2012/wordml" xmlns:w16cex="http://schemas.microsoft.com/office/word/2018/wordml/cex" xmlns:w16cid="http://schemas.microsoft.com/office/word/2016/wordml/cid" xmlns:w16="http://schemas.microsoft.com/office/word/2018/wordml" xmlns:w16du="http://schemas.microsoft.com/office/word/2023/wordml/word16du" xmlns:w16sdtdh="http://schemas.microsoft.com/office/word/2020/wordml/sdtdatahash" xmlns:w16sdtfl="http://schemas.microsoft.com/office/word/2024/wordml/sdtformatlock" xmlns:w16se="http://schemas.microsoft.com/office/word/2015/wordml/symex" xmlns:wpg="http://schemas.microsoft.com/office/word/2010/wordprocessingGroup" xmlns:wpi="http://schemas.microsoft.com/office/word/2010/wordprocessingInk" xmlns:wne="http://schemas.microsoft.com/office/word/2006/wordml" xmlns:wps="http://schemas.microsoft.com/office/word/2010/wordprocessingShape" mc:Ignorable="w14 w15 w16se w16cid w16 w16cex w16sdtdh w16sdtfl w16du wp14">
   <w:abstractNum w:abstractNumId="0" w15:restartNumberingAfterBreak="0">
-    <w:nsid w:val="1695740A"/>
+    <w:nsid w:val="6C51329B"/>
     <w:multiLevelType w:val="multilevel"/>
-    <w:tmpl w:val="ECD8B106"/>
+    <w:tmpl w:val="2FF2C11A"/>
     <w:lvl w:ilvl="0">
       <w:start w:val="1"/>
       <w:numFmt w:val="bullet"/>
@@ -632,7 +714,7 @@
       </w:rPr>
     </w:lvl>
   </w:abstractNum>
-  <w:num w:numId="1" w16cid:durableId="1424648824">
+  <w:num w:numId="1" w16cid:durableId="1403986762">
     <w:abstractNumId w:val="0"/>
   </w:num>
 </w:numbering>
@@ -1046,7 +1128,7 @@
     <w:link w:val="Heading1Char"/>
     <w:uiPriority w:val="9"/>
     <w:qFormat/>
-    <w:rsid w:val="00586FAC"/>
+    <w:rsid w:val="00CD1C33"/>
     <w:pPr>
       <w:keepNext/>
       <w:keepLines/>
@@ -1069,7 +1151,7 @@
     <w:semiHidden/>
     <w:unhideWhenUsed/>
     <w:qFormat/>
-    <w:rsid w:val="00586FAC"/>
+    <w:rsid w:val="00CD1C33"/>
     <w:pPr>
       <w:keepNext/>
       <w:keepLines/>
@@ -1092,7 +1174,7 @@
     <w:semiHidden/>
     <w:unhideWhenUsed/>
     <w:qFormat/>
-    <w:rsid w:val="00586FAC"/>
+    <w:rsid w:val="00CD1C33"/>
     <w:pPr>
       <w:keepNext/>
       <w:keepLines/>
@@ -1115,7 +1197,7 @@
     <w:semiHidden/>
     <w:unhideWhenUsed/>
     <w:qFormat/>
-    <w:rsid w:val="00586FAC"/>
+    <w:rsid w:val="00CD1C33"/>
     <w:pPr>
       <w:keepNext/>
       <w:keepLines/>
@@ -1138,7 +1220,7 @@
     <w:semiHidden/>
     <w:unhideWhenUsed/>
     <w:qFormat/>
-    <w:rsid w:val="00586FAC"/>
+    <w:rsid w:val="00CD1C33"/>
     <w:pPr>
       <w:keepNext/>
       <w:keepLines/>
@@ -1159,7 +1241,7 @@
     <w:semiHidden/>
     <w:unhideWhenUsed/>
     <w:qFormat/>
-    <w:rsid w:val="00586FAC"/>
+    <w:rsid w:val="00CD1C33"/>
     <w:pPr>
       <w:keepNext/>
       <w:keepLines/>
@@ -1182,7 +1264,7 @@
     <w:semiHidden/>
     <w:unhideWhenUsed/>
     <w:qFormat/>
-    <w:rsid w:val="00586FAC"/>
+    <w:rsid w:val="00CD1C33"/>
     <w:pPr>
       <w:keepNext/>
       <w:keepLines/>
@@ -1203,7 +1285,7 @@
     <w:semiHidden/>
     <w:unhideWhenUsed/>
     <w:qFormat/>
-    <w:rsid w:val="00586FAC"/>
+    <w:rsid w:val="00CD1C33"/>
     <w:pPr>
       <w:keepNext/>
       <w:keepLines/>
@@ -1226,7 +1308,7 @@
     <w:semiHidden/>
     <w:unhideWhenUsed/>
     <w:qFormat/>
-    <w:rsid w:val="00586FAC"/>
+    <w:rsid w:val="00CD1C33"/>
     <w:pPr>
       <w:keepNext/>
       <w:keepLines/>
@@ -1269,7 +1351,7 @@
     <w:basedOn w:val="DefaultParagraphFont"/>
     <w:link w:val="Heading1"/>
     <w:uiPriority w:val="9"/>
-    <w:rsid w:val="00586FAC"/>
+    <w:rsid w:val="00CD1C33"/>
     <w:rPr>
       <w:rFonts w:asciiTheme="majorHAnsi" w:eastAsiaTheme="majorEastAsia" w:hAnsiTheme="majorHAnsi" w:cstheme="majorBidi"/>
       <w:color w:val="0F4761" w:themeColor="accent1" w:themeShade="BF"/>
@@ -1283,7 +1365,7 @@
     <w:link w:val="Heading2"/>
     <w:uiPriority w:val="9"/>
     <w:semiHidden/>
-    <w:rsid w:val="00586FAC"/>
+    <w:rsid w:val="00CD1C33"/>
     <w:rPr>
       <w:rFonts w:asciiTheme="majorHAnsi" w:eastAsiaTheme="majorEastAsia" w:hAnsiTheme="majorHAnsi" w:cstheme="majorBidi"/>
       <w:color w:val="0F4761" w:themeColor="accent1" w:themeShade="BF"/>
@@ -1297,7 +1379,7 @@
     <w:link w:val="Heading3"/>
     <w:uiPriority w:val="9"/>
     <w:semiHidden/>
-    <w:rsid w:val="00586FAC"/>
+    <w:rsid w:val="00CD1C33"/>
     <w:rPr>
       <w:rFonts w:eastAsiaTheme="majorEastAsia" w:cstheme="majorBidi"/>
       <w:color w:val="0F4761" w:themeColor="accent1" w:themeShade="BF"/>
@@ -1311,7 +1393,7 @@
     <w:link w:val="Heading4"/>
     <w:uiPriority w:val="9"/>
     <w:semiHidden/>
-    <w:rsid w:val="00586FAC"/>
+    <w:rsid w:val="00CD1C33"/>
     <w:rPr>
       <w:rFonts w:eastAsiaTheme="majorEastAsia" w:cstheme="majorBidi"/>
       <w:i/>
@@ -1325,7 +1407,7 @@
     <w:link w:val="Heading5"/>
     <w:uiPriority w:val="9"/>
     <w:semiHidden/>
-    <w:rsid w:val="00586FAC"/>
+    <w:rsid w:val="00CD1C33"/>
     <w:rPr>
       <w:rFonts w:eastAsiaTheme="majorEastAsia" w:cstheme="majorBidi"/>
       <w:color w:val="0F4761" w:themeColor="accent1" w:themeShade="BF"/>
@@ -1337,7 +1419,7 @@
     <w:link w:val="Heading6"/>
     <w:uiPriority w:val="9"/>
     <w:semiHidden/>
-    <w:rsid w:val="00586FAC"/>
+    <w:rsid w:val="00CD1C33"/>
     <w:rPr>
       <w:rFonts w:eastAsiaTheme="majorEastAsia" w:cstheme="majorBidi"/>
       <w:i/>
@@ -1351,7 +1433,7 @@
     <w:link w:val="Heading7"/>
     <w:uiPriority w:val="9"/>
     <w:semiHidden/>
-    <w:rsid w:val="00586FAC"/>
+    <w:rsid w:val="00CD1C33"/>
     <w:rPr>
       <w:rFonts w:eastAsiaTheme="majorEastAsia" w:cstheme="majorBidi"/>
       <w:color w:val="595959" w:themeColor="text1" w:themeTint="A6"/>
@@ -1363,7 +1445,7 @@
     <w:link w:val="Heading8"/>
     <w:uiPriority w:val="9"/>
     <w:semiHidden/>
-    <w:rsid w:val="00586FAC"/>
+    <w:rsid w:val="00CD1C33"/>
     <w:rPr>
       <w:rFonts w:eastAsiaTheme="majorEastAsia" w:cstheme="majorBidi"/>
       <w:i/>
@@ -1377,7 +1459,7 @@
     <w:link w:val="Heading9"/>
     <w:uiPriority w:val="9"/>
     <w:semiHidden/>
-    <w:rsid w:val="00586FAC"/>
+    <w:rsid w:val="00CD1C33"/>
     <w:rPr>
       <w:rFonts w:eastAsiaTheme="majorEastAsia" w:cstheme="majorBidi"/>
       <w:color w:val="272727" w:themeColor="text1" w:themeTint="D8"/>
@@ -1390,7 +1472,7 @@
     <w:link w:val="TitleChar"/>
     <w:uiPriority w:val="10"/>
     <w:qFormat/>
-    <w:rsid w:val="00586FAC"/>
+    <w:rsid w:val="00CD1C33"/>
     <w:pPr>
       <w:spacing w:after="80" w:line="240" w:lineRule="auto"/>
       <w:contextualSpacing/>
@@ -1408,7 +1490,7 @@
     <w:basedOn w:val="DefaultParagraphFont"/>
     <w:link w:val="Title"/>
     <w:uiPriority w:val="10"/>
-    <w:rsid w:val="00586FAC"/>
+    <w:rsid w:val="00CD1C33"/>
     <w:rPr>
       <w:rFonts w:asciiTheme="majorHAnsi" w:eastAsiaTheme="majorEastAsia" w:hAnsiTheme="majorHAnsi" w:cstheme="majorBidi"/>
       <w:spacing w:val="-10"/>
@@ -1424,7 +1506,7 @@
     <w:link w:val="SubtitleChar"/>
     <w:uiPriority w:val="11"/>
     <w:qFormat/>
-    <w:rsid w:val="00586FAC"/>
+    <w:rsid w:val="00CD1C33"/>
     <w:pPr>
       <w:numPr>
         <w:ilvl w:val="1"/>
@@ -1443,7 +1525,7 @@
     <w:basedOn w:val="DefaultParagraphFont"/>
     <w:link w:val="Subtitle"/>
     <w:uiPriority w:val="11"/>
-    <w:rsid w:val="00586FAC"/>
+    <w:rsid w:val="00CD1C33"/>
     <w:rPr>
       <w:rFonts w:eastAsiaTheme="majorEastAsia" w:cstheme="majorBidi"/>
       <w:color w:val="595959" w:themeColor="text1" w:themeTint="A6"/>
@@ -1459,7 +1541,7 @@
     <w:link w:val="QuoteChar"/>
     <w:uiPriority w:val="29"/>
     <w:qFormat/>
-    <w:rsid w:val="00586FAC"/>
+    <w:rsid w:val="00CD1C33"/>
     <w:pPr>
       <w:spacing w:before="160"/>
       <w:jc w:val="center"/>
@@ -1475,7 +1557,7 @@
     <w:basedOn w:val="DefaultParagraphFont"/>
     <w:link w:val="Quote"/>
     <w:uiPriority w:val="29"/>
-    <w:rsid w:val="00586FAC"/>
+    <w:rsid w:val="00CD1C33"/>
     <w:rPr>
       <w:i/>
       <w:iCs/>
@@ -1487,7 +1569,7 @@
     <w:basedOn w:val="Normal"/>
     <w:uiPriority w:val="34"/>
     <w:qFormat/>
-    <w:rsid w:val="00586FAC"/>
+    <w:rsid w:val="00CD1C33"/>
     <w:pPr>
       <w:ind w:left="720"/>
       <w:contextualSpacing/>
@@ -1498,7 +1580,7 @@
     <w:basedOn w:val="DefaultParagraphFont"/>
     <w:uiPriority w:val="21"/>
     <w:qFormat/>
-    <w:rsid w:val="00586FAC"/>
+    <w:rsid w:val="00CD1C33"/>
     <w:rPr>
       <w:i/>
       <w:iCs/>
@@ -1512,7 +1594,7 @@
     <w:link w:val="IntenseQuoteChar"/>
     <w:uiPriority w:val="30"/>
     <w:qFormat/>
-    <w:rsid w:val="00586FAC"/>
+    <w:rsid w:val="00CD1C33"/>
     <w:pPr>
       <w:pBdr>
         <w:top w:val="single" w:sz="4" w:space="10" w:color="0F4761" w:themeColor="accent1" w:themeShade="BF"/>
@@ -1533,7 +1615,7 @@
     <w:basedOn w:val="DefaultParagraphFont"/>
     <w:link w:val="IntenseQuote"/>
     <w:uiPriority w:val="30"/>
-    <w:rsid w:val="00586FAC"/>
+    <w:rsid w:val="00CD1C33"/>
     <w:rPr>
       <w:i/>
       <w:iCs/>
@@ -1545,13 +1627,36 @@
     <w:basedOn w:val="DefaultParagraphFont"/>
     <w:uiPriority w:val="32"/>
     <w:qFormat/>
-    <w:rsid w:val="00586FAC"/>
+    <w:rsid w:val="00CD1C33"/>
     <w:rPr>
       <w:b/>
       <w:bCs/>
       <w:smallCaps/>
       <w:color w:val="0F4761" w:themeColor="accent1" w:themeShade="BF"/>
       <w:spacing w:val="5"/>
+    </w:rPr>
+  </w:style>
+  <w:style w:type="character" w:styleId="Hyperlink">
+    <w:name w:val="Hyperlink"/>
+    <w:basedOn w:val="DefaultParagraphFont"/>
+    <w:uiPriority w:val="99"/>
+    <w:unhideWhenUsed/>
+    <w:rsid w:val="00CD1C33"/>
+    <w:rPr>
+      <w:color w:val="467886" w:themeColor="hyperlink"/>
+      <w:u w:val="single"/>
+    </w:rPr>
+  </w:style>
+  <w:style w:type="character" w:styleId="UnresolvedMention">
+    <w:name w:val="Unresolved Mention"/>
+    <w:basedOn w:val="DefaultParagraphFont"/>
+    <w:uiPriority w:val="99"/>
+    <w:semiHidden/>
+    <w:unhideWhenUsed/>
+    <w:rsid w:val="00CD1C33"/>
+    <w:rPr>
+      <w:color w:val="605E5C"/>
+      <w:shd w:val="clear" w:color="auto" w:fill="E1DFDD"/>
     </w:rPr>
   </w:style>
 </w:styles>

</xml_diff>